<commit_message>
Add group number and adviser to title page
Co-Authored-By: Claude Opus 5.5 <noreply@anthropic.com>
Claude-Session: https://claude.ai/code/session_01SFLwRDgj2YFFdZAcChzMKW
</commit_message>
<xml_diff>
--- a/HYDROCLEAR/Group_1_HYDROCLEAR_Title_Page.docx
+++ b/HYDROCLEAR/Group_1_HYDROCLEAR_Title_Page.docx
@@ -72,7 +72,7 @@
     </w:p>
     <w:p>
       <w:pPr>
-        <w:spacing w:before="0" w:after="800"/>
+        <w:spacing w:before="0" w:after="640"/>
         <w:jc w:val="center"/>
       </w:pPr>
       <w:r>
@@ -86,7 +86,21 @@
     </w:p>
     <w:p>
       <w:pPr>
-        <w:spacing w:before="0" w:after="280"/>
+        <w:spacing w:before="0" w:after="320"/>
+        <w:jc w:val="center"/>
+      </w:pPr>
+      <w:r>
+        <w:rPr>
+          <w:b/>
+          <w:i w:val="0"/>
+          <w:sz w:val="26"/>
+        </w:rPr>
+        <w:t>Group 1</w:t>
+      </w:r>
+    </w:p>
+    <w:p>
+      <w:pPr>
+        <w:spacing w:before="0" w:after="240"/>
         <w:jc w:val="center"/>
       </w:pPr>
       <w:r>
@@ -100,7 +114,7 @@
     </w:p>
     <w:p>
       <w:pPr>
-        <w:spacing w:before="0" w:after="280"/>
+        <w:spacing w:before="0" w:after="240"/>
         <w:jc w:val="center"/>
       </w:pPr>
       <w:r>
@@ -114,7 +128,7 @@
     </w:p>
     <w:p>
       <w:pPr>
-        <w:spacing w:before="0" w:after="280"/>
+        <w:spacing w:before="0" w:after="240"/>
         <w:jc w:val="center"/>
       </w:pPr>
       <w:r>
@@ -128,7 +142,7 @@
     </w:p>
     <w:p>
       <w:pPr>
-        <w:spacing w:before="0" w:after="280"/>
+        <w:spacing w:before="0" w:after="240"/>
         <w:jc w:val="center"/>
       </w:pPr>
       <w:r>
@@ -142,7 +156,7 @@
     </w:p>
     <w:p>
       <w:pPr>
-        <w:spacing w:before="0" w:after="280"/>
+        <w:spacing w:before="0" w:after="240"/>
         <w:jc w:val="center"/>
       </w:pPr>
       <w:r>
@@ -156,7 +170,7 @@
     </w:p>
     <w:p>
       <w:pPr>
-        <w:spacing w:before="0" w:after="280"/>
+        <w:spacing w:before="0" w:after="240"/>
         <w:jc w:val="center"/>
       </w:pPr>
       <w:r>
@@ -170,7 +184,7 @@
     </w:p>
     <w:p>
       <w:pPr>
-        <w:spacing w:before="0" w:after="280"/>
+        <w:spacing w:before="0" w:after="240"/>
         <w:jc w:val="center"/>
       </w:pPr>
       <w:r>
@@ -184,7 +198,7 @@
     </w:p>
     <w:p>
       <w:pPr>
-        <w:spacing w:before="0" w:after="280"/>
+        <w:spacing w:before="0" w:after="240"/>
         <w:jc w:val="center"/>
       </w:pPr>
       <w:r>
@@ -198,7 +212,7 @@
     </w:p>
     <w:p>
       <w:pPr>
-        <w:spacing w:before="0" w:after="280"/>
+        <w:spacing w:before="0" w:after="240"/>
         <w:jc w:val="center"/>
       </w:pPr>
       <w:r>
@@ -208,6 +222,25 @@
           <w:sz w:val="24"/>
         </w:rPr>
         <w:t>Sumang, Wohan Jace P.</w:t>
+      </w:r>
+    </w:p>
+    <w:p>
+      <w:pPr>
+        <w:spacing w:before="600" w:after="0"/>
+        <w:jc w:val="center"/>
+      </w:pPr>
+      <w:r>
+        <w:rPr>
+          <w:sz w:val="24"/>
+        </w:rPr>
+        <w:t xml:space="preserve">Submitted to: </w:t>
+      </w:r>
+      <w:r>
+        <w:rPr>
+          <w:b/>
+          <w:sz w:val="24"/>
+        </w:rPr>
+        <w:t>Sir Jericho Gonzales</w:t>
       </w:r>
     </w:p>
     <w:sectPr>

</xml_diff>